<commit_message>
human quest v1 done
</commit_message>
<xml_diff>
--- a/Human Dialogue.docx
+++ b/Human Dialogue.docx
@@ -146,10 +146,7 @@
       </w:r>
       <w:r>
         <w:tab/>
-        <w:t xml:space="preserve">E - </w:t>
-      </w:r>
-      <w:r>
-        <w:t>Young people these days got no respect for their elders ay.</w:t>
+        <w:t>E - Young people these days got no respect for their elders ay.</w:t>
       </w:r>
     </w:p>
     <w:p>
@@ -273,10 +270,7 @@
         <w:ind w:left="1440"/>
       </w:pPr>
       <w:r>
-        <w:t xml:space="preserve">E - </w:t>
-      </w:r>
-      <w:r>
-        <w:t>Go to the edge of the farms and get me a stopwatch from the woman that lives there her names Maragret.</w:t>
+        <w:t>E - Go to the edge of the farms and get me a stopwatch from the woman that lives there her names Maragret.</w:t>
       </w:r>
     </w:p>
     <w:p>
@@ -318,15 +312,7 @@
       </w:r>
       <w:r>
         <w:tab/>
-        <w:t xml:space="preserve">E – You’ll see when </w:t>
-      </w:r>
-      <w:proofErr w:type="spellStart"/>
-      <w:r>
-        <w:t>ya</w:t>
-      </w:r>
-      <w:proofErr w:type="spellEnd"/>
-      <w:r>
-        <w:t xml:space="preserve"> get there.</w:t>
+        <w:t>E – You’ll see when ya get there.</w:t>
       </w:r>
     </w:p>
     <w:p>
@@ -370,15 +356,7 @@
       </w:r>
       <w:r>
         <w:tab/>
-        <w:t xml:space="preserve">E – You </w:t>
-      </w:r>
-      <w:proofErr w:type="gramStart"/>
-      <w:r>
-        <w:t>saying</w:t>
-      </w:r>
-      <w:proofErr w:type="gramEnd"/>
-      <w:r>
-        <w:t xml:space="preserve"> your only strong enough to pick on an old man like me</w:t>
+        <w:t>E – You saying your only strong enough to pick on an old man like me</w:t>
       </w:r>
     </w:p>
     <w:p>
@@ -419,15 +397,7 @@
         <w:ind w:left="1440"/>
       </w:pPr>
       <w:r>
-        <w:t xml:space="preserve">E – Don’t worry about me I bet you’ll have enough experiences to kill </w:t>
-      </w:r>
-      <w:proofErr w:type="spellStart"/>
-      <w:r>
-        <w:t>ya</w:t>
-      </w:r>
-      <w:proofErr w:type="spellEnd"/>
-      <w:r>
-        <w:t xml:space="preserve"> so here’s your first one brat. Go to the edge of the farms and get me a stopwatch from the woman that lives there</w:t>
+        <w:t>E – Don’t worry about me I bet you’ll have enough experiences to kill ya so here’s your first one brat. Go to the edge of the farms and get me a stopwatch from the woman that lives there</w:t>
       </w:r>
       <w:r>
         <w:t xml:space="preserve"> her names Maragret</w:t>
@@ -452,15 +422,7 @@
         <w:ind w:left="1440"/>
       </w:pPr>
       <w:r>
-        <w:t xml:space="preserve">E – I’ll make sure to beat a few lessons into </w:t>
-      </w:r>
-      <w:proofErr w:type="spellStart"/>
-      <w:r>
-        <w:t>ya</w:t>
-      </w:r>
-      <w:proofErr w:type="spellEnd"/>
-      <w:r>
-        <w:t xml:space="preserve"> first brat</w:t>
+        <w:t>E – I’ll make sure to beat a few lessons into ya first brat</w:t>
       </w:r>
       <w:r>
         <w:t>,</w:t>
@@ -479,28 +441,790 @@
       </w:r>
     </w:p>
     <w:p>
-      <w:r>
-        <w:tab/>
-      </w:r>
-      <w:r>
-        <w:tab/>
-      </w:r>
-    </w:p>
-    <w:p>
-      <w:r>
-        <w:tab/>
-      </w:r>
-      <w:r>
-        <w:tab/>
-      </w:r>
-      <w:r>
-        <w:tab/>
-      </w:r>
-      <w:r>
-        <w:tab/>
-      </w:r>
+      <w:pPr>
+        <w:pBdr>
+          <w:bottom w:val="single" w:sz="12" w:space="1" w:color="auto"/>
+        </w:pBdr>
+      </w:pPr>
     </w:p>
     <w:p/>
+    <w:p>
+      <w:r>
+        <w:t>Knight</w:t>
+      </w:r>
+    </w:p>
+    <w:p>
+      <w:r>
+        <w:t>K - …</w:t>
+      </w:r>
+    </w:p>
+    <w:p>
+      <w:r>
+        <w:tab/>
+        <w:t>P – Do you know where the old lady has gone.</w:t>
+      </w:r>
+    </w:p>
+    <w:p>
+      <w:r>
+        <w:t>K</w:t>
+      </w:r>
+      <w:r>
+        <w:t>1</w:t>
+      </w:r>
+      <w:r>
+        <w:t xml:space="preserve"> – Why are you looking for her.</w:t>
+      </w:r>
+    </w:p>
+    <w:p>
+      <w:r>
+        <w:tab/>
+        <w:t>P – I need to get something from her.</w:t>
+      </w:r>
+    </w:p>
+    <w:p>
+      <w:r>
+        <w:tab/>
+      </w:r>
+      <w:r>
+        <w:tab/>
+        <w:t>K – What would someone not from this village need from an old lady.</w:t>
+      </w:r>
+    </w:p>
+    <w:p>
+      <w:r>
+        <w:tab/>
+      </w:r>
+      <w:r>
+        <w:tab/>
+      </w:r>
+      <w:r>
+        <w:tab/>
+        <w:t>P – How does everyone know I’m not from around here.</w:t>
+      </w:r>
+    </w:p>
+    <w:p>
+      <w:r>
+        <w:lastRenderedPageBreak/>
+        <w:tab/>
+      </w:r>
+      <w:r>
+        <w:tab/>
+      </w:r>
+      <w:r>
+        <w:tab/>
+      </w:r>
+      <w:r>
+        <w:tab/>
+        <w:t>K – Theres only older people left in this village.</w:t>
+      </w:r>
+    </w:p>
+    <w:p>
+      <w:r>
+        <w:tab/>
+      </w:r>
+      <w:r>
+        <w:tab/>
+      </w:r>
+      <w:r>
+        <w:tab/>
+      </w:r>
+      <w:r>
+        <w:tab/>
+      </w:r>
+      <w:r>
+        <w:tab/>
+        <w:t>P – Why is that.</w:t>
+      </w:r>
+    </w:p>
+    <w:p>
+      <w:pPr>
+        <w:ind w:left="2880"/>
+      </w:pPr>
+      <w:r>
+        <w:t>K – If you want more information go talk to The Elder, he will be more willing to accommodate you.</w:t>
+      </w:r>
+    </w:p>
+    <w:p>
+      <w:pPr>
+        <w:ind w:left="2880"/>
+      </w:pPr>
+      <w:r>
+        <w:tab/>
+        <w:t>P – That old man is the one that sent me here.</w:t>
+      </w:r>
+    </w:p>
+    <w:p>
+      <w:pPr>
+        <w:ind w:left="2880"/>
+      </w:pPr>
+      <w:r>
+        <w:tab/>
+      </w:r>
+      <w:r>
+        <w:tab/>
+        <w:t>K – K</w:t>
+      </w:r>
+      <w:r>
+        <w:t>2</w:t>
+      </w:r>
+    </w:p>
+    <w:p>
+      <w:pPr>
+        <w:ind w:left="2880"/>
+      </w:pPr>
+      <w:r>
+        <w:tab/>
+        <w:t>P – He didn’t seem very friendly before.</w:t>
+      </w:r>
+    </w:p>
+    <w:p>
+      <w:pPr>
+        <w:ind w:left="2880"/>
+      </w:pPr>
+      <w:r>
+        <w:tab/>
+      </w:r>
+      <w:r>
+        <w:tab/>
+        <w:t>K – K</w:t>
+      </w:r>
+      <w:r>
+        <w:t>2</w:t>
+      </w:r>
+    </w:p>
+    <w:p>
+      <w:pPr>
+        <w:ind w:left="2880"/>
+      </w:pPr>
+      <w:r>
+        <w:t>K</w:t>
+      </w:r>
+      <w:r>
+        <w:t>2</w:t>
+      </w:r>
+      <w:r>
+        <w:t xml:space="preserve"> – If he sent you here then I guess he’s playing his old tricks again.</w:t>
+      </w:r>
+    </w:p>
+    <w:p>
+      <w:pPr>
+        <w:ind w:left="2880" w:firstLine="720"/>
+      </w:pPr>
+      <w:r>
+        <w:t>P – So he does this to everyone.</w:t>
+      </w:r>
+    </w:p>
+    <w:p>
+      <w:pPr>
+        <w:ind w:left="2880"/>
+      </w:pPr>
+      <w:r>
+        <w:t>K – You certainly aren’t the first, but at this rate you may very well be the last.</w:t>
+      </w:r>
+    </w:p>
+    <w:p>
+      <w:pPr>
+        <w:ind w:left="3600"/>
+      </w:pPr>
+      <w:r>
+        <w:t>P – If you aren’t going to tell me anything can I go see the old lady.</w:t>
+      </w:r>
+    </w:p>
+    <w:p>
+      <w:r>
+        <w:tab/>
+      </w:r>
+      <w:r>
+        <w:tab/>
+      </w:r>
+      <w:r>
+        <w:tab/>
+      </w:r>
+      <w:r>
+        <w:tab/>
+        <w:t>K – Afraid you’re not in luck, she’s already “crossed the river”.</w:t>
+      </w:r>
+    </w:p>
+    <w:p>
+      <w:r>
+        <w:tab/>
+      </w:r>
+      <w:r>
+        <w:tab/>
+      </w:r>
+      <w:r>
+        <w:tab/>
+      </w:r>
+      <w:r>
+        <w:tab/>
+      </w:r>
+      <w:r>
+        <w:tab/>
+        <w:t>P – Is there at least a stopwatch in there.</w:t>
+      </w:r>
+    </w:p>
+    <w:p>
+      <w:r>
+        <w:tab/>
+      </w:r>
+      <w:r>
+        <w:tab/>
+      </w:r>
+      <w:r>
+        <w:tab/>
+      </w:r>
+      <w:r>
+        <w:tab/>
+        <w:t>K – You can have it if you want.</w:t>
+      </w:r>
+    </w:p>
+    <w:p>
+      <w:r>
+        <w:tab/>
+      </w:r>
+      <w:r>
+        <w:tab/>
+      </w:r>
+      <w:r>
+        <w:tab/>
+      </w:r>
+      <w:r>
+        <w:tab/>
+      </w:r>
+      <w:r>
+        <w:tab/>
+        <w:t xml:space="preserve">P – </w:t>
+      </w:r>
+      <w:r>
+        <w:t>You’re</w:t>
+      </w:r>
+      <w:r>
+        <w:t xml:space="preserve"> just giving it to me?</w:t>
+      </w:r>
+    </w:p>
+    <w:p>
+      <w:pPr>
+        <w:ind w:left="4320"/>
+      </w:pPr>
+      <w:r>
+        <w:t>K – Its not worth much to anyone except for The Elder anyway.</w:t>
+      </w:r>
+    </w:p>
+    <w:p>
+      <w:pPr>
+        <w:ind w:left="4320"/>
+      </w:pPr>
+      <w:r>
+        <w:tab/>
+        <w:t>END</w:t>
+      </w:r>
+    </w:p>
+    <w:p>
+      <w:r>
+        <w:tab/>
+      </w:r>
+      <w:r>
+        <w:tab/>
+      </w:r>
+      <w:r>
+        <w:tab/>
+      </w:r>
+      <w:r>
+        <w:tab/>
+      </w:r>
+      <w:r>
+        <w:tab/>
+        <w:t xml:space="preserve">P </w:t>
+      </w:r>
+      <w:r>
+        <w:t>–</w:t>
+      </w:r>
+      <w:r>
+        <w:t xml:space="preserve"> </w:t>
+      </w:r>
+      <w:r>
+        <w:t>Guess I’ll give this to the old man then.</w:t>
+      </w:r>
+    </w:p>
+    <w:p>
+      <w:r>
+        <w:tab/>
+      </w:r>
+      <w:r>
+        <w:tab/>
+      </w:r>
+      <w:r>
+        <w:tab/>
+      </w:r>
+      <w:r>
+        <w:tab/>
+      </w:r>
+      <w:r>
+        <w:tab/>
+      </w:r>
+      <w:r>
+        <w:tab/>
+        <w:t>END</w:t>
+      </w:r>
+    </w:p>
+    <w:p>
+      <w:r>
+        <w:tab/>
+      </w:r>
+      <w:r>
+        <w:tab/>
+      </w:r>
+      <w:r>
+        <w:tab/>
+        <w:t xml:space="preserve">P </w:t>
+      </w:r>
+      <w:r>
+        <w:t>–</w:t>
+      </w:r>
+      <w:r>
+        <w:t xml:space="preserve"> </w:t>
+      </w:r>
+      <w:r>
+        <w:t>I could say the same about you.</w:t>
+      </w:r>
+    </w:p>
+    <w:p>
+      <w:pPr>
+        <w:ind w:left="2880"/>
+      </w:pPr>
+      <w:r>
+        <w:t>K – I came from this village so I’m just a man coming to see his home one last time.</w:t>
+      </w:r>
+    </w:p>
+    <w:p>
+      <w:pPr>
+        <w:ind w:left="2880"/>
+      </w:pPr>
+      <w:r>
+        <w:tab/>
+        <w:t>P – Why is this the last time?</w:t>
+      </w:r>
+    </w:p>
+    <w:p>
+      <w:pPr>
+        <w:ind w:left="4320"/>
+      </w:pPr>
+      <w:r>
+        <w:t>K – If The Elder sent you then take this stopwatch and be gone, I’m in no mood to talk to stranger.</w:t>
+      </w:r>
+    </w:p>
+    <w:p>
+      <w:pPr>
+        <w:ind w:left="4320"/>
+      </w:pPr>
+      <w:r>
+        <w:tab/>
+        <w:t>END</w:t>
+      </w:r>
+    </w:p>
+    <w:p>
+      <w:r>
+        <w:tab/>
+      </w:r>
+      <w:r>
+        <w:tab/>
+      </w:r>
+      <w:r>
+        <w:tab/>
+      </w:r>
+      <w:r>
+        <w:tab/>
+      </w:r>
+      <w:r>
+        <w:tab/>
+        <w:t>P – You being sent to the gallows or something?</w:t>
+      </w:r>
+    </w:p>
+    <w:p>
+      <w:pPr>
+        <w:ind w:left="4320"/>
+      </w:pPr>
+      <w:r>
+        <w:t>K – It’s not me that’s about to pass on, so if I was you I would leave this village soon.</w:t>
+      </w:r>
+    </w:p>
+    <w:p>
+      <w:pPr>
+        <w:ind w:left="5040"/>
+      </w:pPr>
+      <w:r>
+        <w:lastRenderedPageBreak/>
+        <w:t>P – I can’t leave till I have complete the request from The Elder.</w:t>
+      </w:r>
+    </w:p>
+    <w:p>
+      <w:pPr>
+        <w:ind w:left="4320"/>
+      </w:pPr>
+      <w:r>
+        <w:t>K – Then take whatever you need and get out, with haste.</w:t>
+      </w:r>
+    </w:p>
+    <w:p>
+      <w:pPr>
+        <w:ind w:left="4320"/>
+      </w:pPr>
+      <w:r>
+        <w:tab/>
+        <w:t>END</w:t>
+      </w:r>
+    </w:p>
+    <w:p>
+      <w:r>
+        <w:tab/>
+        <w:t>P – None of your business.</w:t>
+      </w:r>
+    </w:p>
+    <w:p>
+      <w:r>
+        <w:tab/>
+      </w:r>
+      <w:r>
+        <w:tab/>
+        <w:t>K – Either tell me or get lost, you’re wasting my time.</w:t>
+      </w:r>
+    </w:p>
+    <w:p>
+      <w:r>
+        <w:tab/>
+      </w:r>
+      <w:r>
+        <w:tab/>
+        <w:t>K – K1</w:t>
+      </w:r>
+    </w:p>
+    <w:p>
+      <w:pPr>
+        <w:pBdr>
+          <w:bottom w:val="single" w:sz="12" w:space="1" w:color="auto"/>
+        </w:pBdr>
+      </w:pPr>
+    </w:p>
+    <w:p>
+      <w:r>
+        <w:t>The Elder part 2</w:t>
+      </w:r>
+    </w:p>
+    <w:p/>
+    <w:p>
+      <w:r>
+        <w:t>E – So have finally managed to get the item I asked for?</w:t>
+      </w:r>
+    </w:p>
+    <w:p>
+      <w:r>
+        <w:tab/>
+        <w:t>P – It wasn’t as easy as asking an old lady for it.</w:t>
+      </w:r>
+    </w:p>
+    <w:p>
+      <w:r>
+        <w:tab/>
+      </w:r>
+      <w:r>
+        <w:tab/>
+        <w:t>E – So who had it instead.</w:t>
+      </w:r>
+    </w:p>
+    <w:p>
+      <w:r>
+        <w:tab/>
+      </w:r>
+      <w:r>
+        <w:tab/>
+      </w:r>
+      <w:r>
+        <w:tab/>
+        <w:t>P – A fancy looking knight.</w:t>
+      </w:r>
+    </w:p>
+    <w:p>
+      <w:pPr>
+        <w:ind w:left="1440"/>
+      </w:pPr>
+      <w:r>
+        <w:t>E – What’s that brat still doing here I thought I told him to leave before he gets killed as well.</w:t>
+      </w:r>
+    </w:p>
+    <w:p>
+      <w:pPr>
+        <w:ind w:left="1440"/>
+      </w:pPr>
+      <w:r>
+        <w:tab/>
+        <w:t>P – I feel like I should be leaving as well.</w:t>
+      </w:r>
+    </w:p>
+    <w:p>
+      <w:pPr>
+        <w:ind w:left="2880"/>
+      </w:pPr>
+      <w:r>
+        <w:t>E – Getting cold feet are we, but your right it would be best if you left before the day ends.</w:t>
+      </w:r>
+    </w:p>
+    <w:p>
+      <w:pPr>
+        <w:ind w:left="2880"/>
+      </w:pPr>
+      <w:r>
+        <w:t>E – E 3</w:t>
+      </w:r>
+    </w:p>
+    <w:p>
+      <w:pPr>
+        <w:ind w:left="1440"/>
+      </w:pPr>
+      <w:r>
+        <w:tab/>
+        <w:t>P – He said something similar.</w:t>
+      </w:r>
+    </w:p>
+    <w:p>
+      <w:pPr>
+        <w:ind w:left="1440"/>
+      </w:pPr>
+      <w:r>
+        <w:tab/>
+      </w:r>
+      <w:r>
+        <w:tab/>
+        <w:t>E – E 3</w:t>
+      </w:r>
+    </w:p>
+    <w:p>
+      <w:pPr>
+        <w:ind w:left="1440"/>
+      </w:pPr>
+      <w:r>
+        <w:t>E 3 – This village has been a centre piece for the lord of this region for years.</w:t>
+      </w:r>
+    </w:p>
+    <w:p>
+      <w:pPr>
+        <w:ind w:left="1440"/>
+      </w:pPr>
+      <w:r>
+        <w:tab/>
+        <w:t>P – sounds like an easy job.</w:t>
+      </w:r>
+    </w:p>
+    <w:p>
+      <w:pPr>
+        <w:ind w:left="1440"/>
+      </w:pPr>
+      <w:r>
+        <w:t>E – Sounds, looks and even feels those were our issues.</w:t>
+      </w:r>
+    </w:p>
+    <w:p>
+      <w:pPr>
+        <w:ind w:left="1440"/>
+      </w:pPr>
+      <w:r>
+        <w:tab/>
+        <w:t>P – I have no idea what your prattling on about.</w:t>
+      </w:r>
+    </w:p>
+    <w:p>
+      <w:pPr>
+        <w:ind w:left="1440"/>
+      </w:pPr>
+      <w:r>
+        <w:t>E – Every time some other lord or official came to visit our lord he would take them past our village to show case his prize pets in perfect condition.</w:t>
+      </w:r>
+    </w:p>
+    <w:p>
+      <w:pPr>
+        <w:ind w:left="1440"/>
+      </w:pPr>
+      <w:r>
+        <w:tab/>
+        <w:t>P – I’m guessing the problems came from the “perfect” part.</w:t>
+      </w:r>
+    </w:p>
+    <w:p>
+      <w:pPr>
+        <w:ind w:left="1440"/>
+      </w:pPr>
+      <w:r>
+        <w:t xml:space="preserve">E </w:t>
+      </w:r>
+      <w:r>
+        <w:t>–</w:t>
+      </w:r>
+      <w:r>
+        <w:t xml:space="preserve"> </w:t>
+      </w:r>
+      <w:r>
+        <w:t>Whenever a slight flaw was found the taxes would get increased, it wasn’t long before they were so high not even a king could afford them.</w:t>
+      </w:r>
+    </w:p>
+    <w:p>
+      <w:pPr>
+        <w:ind w:left="1440"/>
+      </w:pPr>
+      <w:r>
+        <w:tab/>
+        <w:t>P – How did you pay then?</w:t>
+      </w:r>
+    </w:p>
+    <w:p>
+      <w:pPr>
+        <w:ind w:left="1440"/>
+      </w:pPr>
+      <w:r>
+        <w:lastRenderedPageBreak/>
+        <w:t>E – Our o’so benevolent lord gave us the option of reinforcing his cannon fodder division.</w:t>
+      </w:r>
+    </w:p>
+    <w:p>
+      <w:pPr>
+        <w:ind w:left="1440"/>
+      </w:pPr>
+      <w:r>
+        <w:tab/>
+        <w:t>P – That explains the lack of people and the pristine village.</w:t>
+      </w:r>
+    </w:p>
+    <w:p>
+      <w:pPr>
+        <w:ind w:left="1440"/>
+      </w:pPr>
+      <w:r>
+        <w:tab/>
+      </w:r>
+      <w:r>
+        <w:tab/>
+        <w:t>E – E 4</w:t>
+      </w:r>
+    </w:p>
+    <w:p>
+      <w:pPr>
+        <w:ind w:left="1440"/>
+      </w:pPr>
+      <w:r>
+        <w:tab/>
+        <w:t>P – So all your people are dead?</w:t>
+      </w:r>
+    </w:p>
+    <w:p>
+      <w:pPr>
+        <w:ind w:left="2880"/>
+      </w:pPr>
+      <w:r>
+        <w:t>E – Well this crafty old man had a few tricks up his sleeve, I managed to get a few people out without the lord noticing</w:t>
+      </w:r>
+      <w:r>
+        <w:t xml:space="preserve">. </w:t>
+      </w:r>
+    </w:p>
+    <w:p>
+      <w:pPr>
+        <w:ind w:left="2880"/>
+      </w:pPr>
+      <w:r>
+        <w:t>E – E 4</w:t>
+      </w:r>
+    </w:p>
+    <w:p>
+      <w:pPr>
+        <w:ind w:left="1440"/>
+      </w:pPr>
+      <w:r>
+        <w:t xml:space="preserve">E 4 – </w:t>
+      </w:r>
+      <w:r>
+        <w:t>The knight you saw was a young lad from here who got taken but managed to make quite a name for himself. The old lady was the last villager to go now I’m all that remains.</w:t>
+      </w:r>
+    </w:p>
+    <w:p>
+      <w:r>
+        <w:tab/>
+      </w:r>
+      <w:r>
+        <w:tab/>
+      </w:r>
+      <w:r>
+        <w:tab/>
+        <w:t>P – What are you going to do then.</w:t>
+      </w:r>
+    </w:p>
+    <w:p>
+      <w:pPr>
+        <w:ind w:left="1440"/>
+      </w:pPr>
+      <w:r>
+        <w:t xml:space="preserve">E – </w:t>
+      </w:r>
+      <w:r>
+        <w:t>They say a captain goes down with his ship, so should a village chief, I’ll give that damn lord one last spectacle.</w:t>
+      </w:r>
+    </w:p>
+    <w:p>
+      <w:r>
+        <w:tab/>
+      </w:r>
+      <w:r>
+        <w:tab/>
+      </w:r>
+      <w:r>
+        <w:tab/>
+        <w:t>END</w:t>
+      </w:r>
+    </w:p>
+    <w:p>
+      <w:r>
+        <w:tab/>
+        <w:t>P</w:t>
+      </w:r>
+      <w:r>
+        <w:t xml:space="preserve"> U1</w:t>
+      </w:r>
+      <w:r>
+        <w:t xml:space="preserve"> – I don’t know depends on what you give me in return.</w:t>
+      </w:r>
+    </w:p>
+    <w:p>
+      <w:pPr>
+        <w:ind w:left="1440"/>
+      </w:pPr>
+      <w:r>
+        <w:t>E – Ha we still playing this same dance ay. Well, that’s up to you but you should get out of here brat.</w:t>
+      </w:r>
+    </w:p>
+    <w:p>
+      <w:r>
+        <w:tab/>
+      </w:r>
+      <w:r>
+        <w:tab/>
+      </w:r>
+      <w:r>
+        <w:tab/>
+        <w:t>P – That doesn’t sound like you, so what’s going on here.</w:t>
+      </w:r>
+    </w:p>
+    <w:p>
+      <w:r>
+        <w:tab/>
+      </w:r>
+      <w:r>
+        <w:tab/>
+      </w:r>
+      <w:r>
+        <w:tab/>
+      </w:r>
+      <w:r>
+        <w:tab/>
+        <w:t>E – E 3</w:t>
+      </w:r>
+    </w:p>
     <w:sectPr>
       <w:pgSz w:w="11906" w:h="16838"/>
       <w:pgMar w:top="1440" w:right="1440" w:bottom="1440" w:left="1440" w:header="708" w:footer="708" w:gutter="0"/>
@@ -1234,7 +1958,6 @@
   <w:style w:type="character" w:default="1" w:styleId="DefaultParagraphFont">
     <w:name w:val="Default Paragraph Font"/>
     <w:uiPriority w:val="1"/>
-    <w:semiHidden/>
     <w:unhideWhenUsed/>
   </w:style>
   <w:style w:type="table" w:default="1" w:styleId="TableNormal">

</xml_diff>

<commit_message>
GAI dialogue quest part 1
</commit_message>
<xml_diff>
--- a/Human Dialogue.docx
+++ b/Human Dialogue.docx
@@ -69,6 +69,9 @@
       <w:r>
         <w:t xml:space="preserve">E – Your quite good at getting an old man to talk, but if you want more from me you will have to make it worth my time. </w:t>
       </w:r>
+      <w:r>
+        <w:t>+</w:t>
+      </w:r>
     </w:p>
     <w:p>
       <w:r>
@@ -250,8 +253,13 @@
       </w:pPr>
       <w:r>
         <w:tab/>
-        <w:t>P – I still haven’t said I’m accepting it yet.</w:t>
-      </w:r>
+        <w:t xml:space="preserve">P – </w:t>
+      </w:r>
+      <w:bookmarkStart w:id="0" w:name="_Hlk217833554"/>
+      <w:r>
+        <w:t>I still haven’t said I’m accepting it yet.</w:t>
+      </w:r>
+      <w:bookmarkEnd w:id="0"/>
     </w:p>
     <w:p>
       <w:pPr>
@@ -368,7 +376,15 @@
       </w:r>
       <w:r>
         <w:tab/>
-        <w:t>E – You saying your only strong enough to pick on an old man like me</w:t>
+        <w:t xml:space="preserve">E – You </w:t>
+      </w:r>
+      <w:proofErr w:type="gramStart"/>
+      <w:r>
+        <w:t>saying</w:t>
+      </w:r>
+      <w:proofErr w:type="gramEnd"/>
+      <w:r>
+        <w:t xml:space="preserve"> your only strong enough to pick on an old man like me</w:t>
       </w:r>
     </w:p>
     <w:p>
@@ -846,7 +862,23 @@
         <w:ind w:left="4320"/>
       </w:pPr>
       <w:r>
-        <w:t>K – If The Elder sent you then take this stopwatch and be gone, I’m in no mood to talk to stranger.</w:t>
+        <w:t xml:space="preserve">K – If </w:t>
+      </w:r>
+      <w:proofErr w:type="gramStart"/>
+      <w:r>
+        <w:t>The</w:t>
+      </w:r>
+      <w:proofErr w:type="gramEnd"/>
+      <w:r>
+        <w:t xml:space="preserve"> Elder sent you then take this stopwatch and be </w:t>
+      </w:r>
+      <w:proofErr w:type="gramStart"/>
+      <w:r>
+        <w:t>gone,</w:t>
+      </w:r>
+      <w:proofErr w:type="gramEnd"/>
+      <w:r>
+        <w:t xml:space="preserve"> I’m in no mood to talk to stranger.</w:t>
       </w:r>
     </w:p>
     <w:p>
@@ -882,7 +914,15 @@
       </w:pPr>
       <w:r>
         <w:lastRenderedPageBreak/>
-        <w:t>K – It’s not me that’s about to pass on, so if I was you I would leave this village soon.</w:t>
+        <w:t xml:space="preserve">K – It’s not me that’s about to pass on, so if I was </w:t>
+      </w:r>
+      <w:proofErr w:type="gramStart"/>
+      <w:r>
+        <w:t>you</w:t>
+      </w:r>
+      <w:proofErr w:type="gramEnd"/>
+      <w:r>
+        <w:t xml:space="preserve"> I would leave this village soon.</w:t>
       </w:r>
     </w:p>
     <w:p>
@@ -1064,7 +1104,15 @@
       </w:pPr>
       <w:r>
         <w:tab/>
-        <w:t>P – I have no idea what your prattling on about.</w:t>
+        <w:t xml:space="preserve">P – I have no idea what </w:t>
+      </w:r>
+      <w:proofErr w:type="gramStart"/>
+      <w:r>
+        <w:t>your</w:t>
+      </w:r>
+      <w:proofErr w:type="gramEnd"/>
+      <w:r>
+        <w:t xml:space="preserve"> prattling on about.</w:t>
       </w:r>
     </w:p>
     <w:p>
@@ -1307,7 +1355,15 @@
       </w:r>
       <w:proofErr w:type="spellEnd"/>
       <w:r>
-        <w:t xml:space="preserve"> stay, where can I stay, my cousin they have to let me stay with them.</w:t>
+        <w:t xml:space="preserve"> stay, where can I stay, my cousin they </w:t>
+      </w:r>
+      <w:proofErr w:type="gramStart"/>
+      <w:r>
+        <w:t>have to</w:t>
+      </w:r>
+      <w:proofErr w:type="gramEnd"/>
+      <w:r>
+        <w:t xml:space="preserve"> let me stay with them.</w:t>
       </w:r>
     </w:p>
     <w:p>
@@ -1332,15 +1388,7 @@
         </w:pBdr>
       </w:pPr>
       <w:r>
-        <w:t>W – How much long till they get here, not enough time, not enough time, why- w</w:t>
-      </w:r>
-      <w:proofErr w:type="spellStart"/>
-      <w:r>
-        <w:t>hy</w:t>
-      </w:r>
-      <w:proofErr w:type="spellEnd"/>
-      <w:r>
-        <w:t xml:space="preserve"> does this have to happen to me.</w:t>
+        <w:t>W – How much long till they get here, not enough time, not enough time, why- why does this have to happen to me.</w:t>
       </w:r>
     </w:p>
     <w:p>
@@ -1397,7 +1445,15 @@
         </w:pBdr>
       </w:pPr>
       <w:r>
-        <w:t>B – He should have given us money or make it so we pay less taxes or something.</w:t>
+        <w:t xml:space="preserve">B – He should have given us money or make </w:t>
+      </w:r>
+      <w:proofErr w:type="gramStart"/>
+      <w:r>
+        <w:t>it</w:t>
+      </w:r>
+      <w:proofErr w:type="gramEnd"/>
+      <w:r>
+        <w:t xml:space="preserve"> so we pay less taxes or something.</w:t>
       </w:r>
     </w:p>
     <w:p>

</xml_diff>

<commit_message>
human dialogue implementation start
</commit_message>
<xml_diff>
--- a/Human Dialogue.docx
+++ b/Human Dialogue.docx
@@ -25,29 +25,47 @@
       <w:r>
         <w:t>un.</w:t>
       </w:r>
+      <w:r>
+        <w:t xml:space="preserve"> 10001</w:t>
+      </w:r>
     </w:p>
     <w:p>
       <w:r>
         <w:tab/>
         <w:t>P – I’m new around these parts.</w:t>
       </w:r>
+      <w:r>
+        <w:t xml:space="preserve"> </w:t>
+      </w:r>
+      <w:r>
+        <w:t>1</w:t>
+      </w:r>
     </w:p>
     <w:p>
       <w:r>
         <w:t>E – Guessed as much, there aren’t many of us living here anymore after all.</w:t>
       </w:r>
+      <w:r>
+        <w:t xml:space="preserve"> 10002</w:t>
+      </w:r>
     </w:p>
     <w:p>
       <w:r>
         <w:tab/>
         <w:t>P – Why are there so little people?</w:t>
       </w:r>
+      <w:r>
+        <w:t xml:space="preserve"> 2</w:t>
+      </w:r>
     </w:p>
     <w:p>
       <w:r>
         <w:tab/>
         <w:t>P – I noticed that but didn’t want to pry.</w:t>
       </w:r>
+      <w:r>
+        <w:t xml:space="preserve"> 3</w:t>
+      </w:r>
     </w:p>
     <w:p>
       <w:r>
@@ -59,18 +77,24 @@
       <w:r>
         <w:t xml:space="preserve"> but years of drought and endless taxes have killed us off.</w:t>
       </w:r>
+      <w:r>
+        <w:t xml:space="preserve"> 10003</w:t>
+      </w:r>
     </w:p>
     <w:p>
       <w:r>
         <w:t>P – I wouldn’t have guessed looking at the buildings and roads.</w:t>
       </w:r>
+      <w:r>
+        <w:t xml:space="preserve"> 4</w:t>
+      </w:r>
     </w:p>
     <w:p>
       <w:r>
         <w:t xml:space="preserve">E – Your quite good at getting an old man to talk, but if you want more from me you will have to make it worth my time. </w:t>
       </w:r>
       <w:r>
-        <w:t>+</w:t>
+        <w:t>10004</w:t>
       </w:r>
     </w:p>
     <w:p>
@@ -78,6 +102,9 @@
         <w:tab/>
         <w:t>P – How much do you want?</w:t>
       </w:r>
+      <w:r>
+        <w:t xml:space="preserve"> 5</w:t>
+      </w:r>
     </w:p>
     <w:p>
       <w:r>
@@ -93,6 +120,9 @@
         <w:tab/>
         <w:t>P – Two gold coins sounds reasonable.</w:t>
       </w:r>
+      <w:r>
+        <w:t xml:space="preserve"> 6</w:t>
+      </w:r>
     </w:p>
     <w:p>
       <w:r>
@@ -108,6 +138,9 @@
         <w:tab/>
         <w:t>P – I could just beat it out of you.</w:t>
       </w:r>
+      <w:r>
+        <w:t xml:space="preserve"> 7</w:t>
+      </w:r>
     </w:p>
     <w:p>
       <w:r>
@@ -131,22 +164,34 @@
       <w:r>
         <w:t>E 1 – Don’t me laugh or I’ll lose me last teeth, bet you’ve never seen a gold in your life kiddo.</w:t>
       </w:r>
+      <w:r>
+        <w:t xml:space="preserve"> 10005</w:t>
+      </w:r>
     </w:p>
     <w:p>
       <w:r>
         <w:t>E 2 – Try it I’ll be long dead before you get anything out of me.</w:t>
       </w:r>
+      <w:r>
+        <w:t xml:space="preserve"> 10006</w:t>
+      </w:r>
     </w:p>
     <w:p>
       <w:r>
         <w:t>E – All I want from you is to get me a certain item from an old friend.</w:t>
       </w:r>
+      <w:r>
+        <w:t xml:space="preserve"> 10007</w:t>
+      </w:r>
     </w:p>
     <w:p>
       <w:r>
         <w:tab/>
         <w:t>P – Why can’t you do it yourself?</w:t>
       </w:r>
+      <w:r>
+        <w:t xml:space="preserve"> 8</w:t>
+      </w:r>
     </w:p>
     <w:p>
       <w:r>
@@ -156,12 +201,18 @@
         <w:tab/>
         <w:t>E - Young people these days got no respect for their elders ay.</w:t>
       </w:r>
+      <w:r>
+        <w:t xml:space="preserve"> 10008</w:t>
+      </w:r>
     </w:p>
     <w:p>
       <w:r>
         <w:tab/>
         <w:t>P – Get someone else to do it.</w:t>
       </w:r>
+      <w:r>
+        <w:t xml:space="preserve"> 9</w:t>
+      </w:r>
     </w:p>
     <w:p>
       <w:r>
@@ -170,12 +221,18 @@
       <w:r>
         <w:t xml:space="preserve"> you see.</w:t>
       </w:r>
+      <w:r>
+        <w:t xml:space="preserve"> 10009</w:t>
+      </w:r>
     </w:p>
     <w:p>
       <w:r>
         <w:tab/>
         <w:t>P – So you don’t want others to get hurt.</w:t>
       </w:r>
+      <w:r>
+        <w:t xml:space="preserve"> 10</w:t>
+      </w:r>
     </w:p>
     <w:p>
       <w:r>
@@ -185,6 +242,9 @@
         <w:tab/>
         <w:t>E – We look out for our own around here.</w:t>
       </w:r>
+      <w:r>
+        <w:t xml:space="preserve"> 10010</w:t>
+      </w:r>
     </w:p>
     <w:p>
       <w:r>
@@ -194,6 +254,9 @@
         <w:tab/>
         <w:t>P – Does that have something to do with the request?</w:t>
       </w:r>
+      <w:r>
+        <w:t xml:space="preserve"> 11</w:t>
+      </w:r>
     </w:p>
     <w:p>
       <w:r>
@@ -203,6 +266,9 @@
         <w:tab/>
         <w:t>E – How perceptive.</w:t>
       </w:r>
+      <w:r>
+        <w:t xml:space="preserve"> 10011</w:t>
+      </w:r>
     </w:p>
     <w:p>
       <w:r>
@@ -215,6 +281,9 @@
         <w:tab/>
         <w:t>P – It has its advantages.</w:t>
       </w:r>
+      <w:r>
+        <w:t xml:space="preserve"> 12</w:t>
+      </w:r>
     </w:p>
     <w:p>
       <w:r>
@@ -227,12 +296,16 @@
         <w:tab/>
         <w:t>P – What don’t like smart people.</w:t>
       </w:r>
-    </w:p>
-    <w:p>
-      <w:pPr>
-        <w:ind w:left="1440"/>
-      </w:pPr>
-      <w:r>
+      <w:r>
+        <w:t xml:space="preserve"> 13</w:t>
+      </w:r>
+    </w:p>
+    <w:p>
+      <w:pPr>
+        <w:ind w:left="1440"/>
+      </w:pPr>
+      <w:r>
+        <w:lastRenderedPageBreak/>
         <w:t>E – Being to</w:t>
       </w:r>
       <w:r>
@@ -241,6 +314,9 @@
       <w:r>
         <w:t xml:space="preserve"> perceptive can make others trust you less, take this advice as down payment for the job.</w:t>
       </w:r>
+      <w:r>
+        <w:t xml:space="preserve"> 10012</w:t>
+      </w:r>
     </w:p>
     <w:p>
       <w:pPr>
@@ -260,6 +336,9 @@
         <w:t>I still haven’t said I’m accepting it yet.</w:t>
       </w:r>
       <w:bookmarkEnd w:id="0"/>
+      <w:r>
+        <w:t xml:space="preserve"> 14</w:t>
+      </w:r>
     </w:p>
     <w:p>
       <w:pPr>
@@ -268,6 +347,9 @@
       <w:r>
         <w:t>E – You will otherwise you would have walked off before getting to this point.</w:t>
       </w:r>
+      <w:r>
+        <w:t xml:space="preserve"> 10013</w:t>
+      </w:r>
     </w:p>
     <w:p>
       <w:pPr>
@@ -276,6 +358,9 @@
       <w:r>
         <w:t>P – So what is this job anyway.</w:t>
       </w:r>
+      <w:r>
+        <w:t xml:space="preserve"> 15</w:t>
+      </w:r>
     </w:p>
     <w:p>
       <w:pPr>
@@ -284,6 +369,9 @@
       <w:r>
         <w:t>E - Go to the edge of the farms and get me a stopwatch from the woman that lives there her names Maragret.</w:t>
       </w:r>
+      <w:r>
+        <w:t xml:space="preserve"> 10014</w:t>
+      </w:r>
     </w:p>
     <w:p>
       <w:pPr>
@@ -293,6 +381,9 @@
         <w:tab/>
         <w:t>P – Seems simple enough.</w:t>
       </w:r>
+      <w:r>
+        <w:t xml:space="preserve"> 16</w:t>
+      </w:r>
     </w:p>
     <w:p>
       <w:pPr>
@@ -314,25 +405,23 @@
         <w:tab/>
         <w:t>P – What’s the catch?</w:t>
       </w:r>
-    </w:p>
-    <w:p>
-      <w:pPr>
-        <w:ind w:left="1440"/>
-      </w:pPr>
-      <w:r>
-        <w:tab/>
-      </w:r>
-      <w:r>
-        <w:tab/>
-        <w:t xml:space="preserve">E – You’ll see when </w:t>
-      </w:r>
-      <w:proofErr w:type="spellStart"/>
-      <w:r>
-        <w:t>ya</w:t>
-      </w:r>
-      <w:proofErr w:type="spellEnd"/>
-      <w:r>
-        <w:t xml:space="preserve"> get there.</w:t>
+      <w:r>
+        <w:t xml:space="preserve"> 17</w:t>
+      </w:r>
+    </w:p>
+    <w:p>
+      <w:pPr>
+        <w:ind w:left="1440"/>
+      </w:pPr>
+      <w:r>
+        <w:tab/>
+      </w:r>
+      <w:r>
+        <w:tab/>
+        <w:t>E – You’ll see when ya get there.</w:t>
+      </w:r>
+      <w:r>
+        <w:t xml:space="preserve"> 10015</w:t>
       </w:r>
     </w:p>
     <w:p>
@@ -369,22 +458,32 @@
         <w:tab/>
         <w:t>P U1 – So you want me to take the hits.</w:t>
       </w:r>
-    </w:p>
-    <w:p>
-      <w:r>
-        <w:tab/>
-      </w:r>
-      <w:r>
-        <w:tab/>
-        <w:t xml:space="preserve">E – You </w:t>
-      </w:r>
-      <w:proofErr w:type="gramStart"/>
-      <w:r>
-        <w:t>saying</w:t>
-      </w:r>
-      <w:proofErr w:type="gramEnd"/>
-      <w:r>
-        <w:t xml:space="preserve"> your only strong enough to pick on an old man like me</w:t>
+      <w:r>
+        <w:t xml:space="preserve"> </w:t>
+      </w:r>
+      <w:r>
+        <w:t>18</w:t>
+      </w:r>
+    </w:p>
+    <w:p>
+      <w:r>
+        <w:tab/>
+      </w:r>
+      <w:r>
+        <w:tab/>
+        <w:t>E – You saying your only strong enough to pick on an old man like me</w:t>
+      </w:r>
+      <w:r>
+        <w:t xml:space="preserve"> </w:t>
+      </w:r>
+      <w:r>
+        <w:t>110</w:t>
+      </w:r>
+      <w:r>
+        <w:t>0</w:t>
+      </w:r>
+      <w:r>
+        <w:t>0</w:t>
       </w:r>
     </w:p>
     <w:p>
@@ -401,6 +500,9 @@
       <w:r>
         <w:t>?</w:t>
       </w:r>
+      <w:r>
+        <w:t xml:space="preserve"> 19</w:t>
+      </w:r>
     </w:p>
     <w:p>
       <w:r>
@@ -410,6 +512,9 @@
         <w:tab/>
         <w:t>E – The stronger ones call them experiences.</w:t>
       </w:r>
+      <w:r>
+        <w:t xml:space="preserve">  11001</w:t>
+      </w:r>
     </w:p>
     <w:p>
       <w:r>
@@ -419,21 +524,16 @@
         <w:tab/>
         <w:t>P – I would love to give you another “experience”.</w:t>
       </w:r>
-    </w:p>
-    <w:p>
-      <w:pPr>
-        <w:ind w:left="1440"/>
-      </w:pPr>
-      <w:r>
-        <w:t xml:space="preserve">E – Don’t worry about me I bet you’ll have enough experiences to kill </w:t>
-      </w:r>
-      <w:proofErr w:type="spellStart"/>
-      <w:r>
-        <w:t>ya</w:t>
-      </w:r>
-      <w:proofErr w:type="spellEnd"/>
-      <w:r>
-        <w:t xml:space="preserve"> so here’s your first one brat. Go to the edge of the farms and get me a stopwatch from the woman that lives there</w:t>
+      <w:r>
+        <w:t xml:space="preserve"> 20</w:t>
+      </w:r>
+    </w:p>
+    <w:p>
+      <w:pPr>
+        <w:ind w:left="1440"/>
+      </w:pPr>
+      <w:r>
+        <w:t>E – Don’t worry about me I bet you’ll have enough experiences to kill ya so here’s your first one brat. Go to the edge of the farms and get me a stopwatch from the woman that lives there</w:t>
       </w:r>
       <w:r>
         <w:t xml:space="preserve"> her names Maragret</w:t>
@@ -441,6 +541,9 @@
       <w:r>
         <w:t>.</w:t>
       </w:r>
+      <w:r>
+        <w:t xml:space="preserve"> 11002</w:t>
+      </w:r>
     </w:p>
     <w:p>
       <w:pPr>
@@ -452,27 +555,25 @@
       <w:r>
         <w:t>watch you croak old man.</w:t>
       </w:r>
-    </w:p>
-    <w:p>
-      <w:pPr>
-        <w:ind w:left="1440"/>
-      </w:pPr>
-      <w:r>
-        <w:t xml:space="preserve">E – I’ll make sure to beat a few lessons into </w:t>
-      </w:r>
-      <w:proofErr w:type="spellStart"/>
-      <w:r>
-        <w:t>ya</w:t>
-      </w:r>
-      <w:proofErr w:type="spellEnd"/>
-      <w:r>
-        <w:t xml:space="preserve"> first brat</w:t>
+      <w:r>
+        <w:t xml:space="preserve"> 21</w:t>
+      </w:r>
+    </w:p>
+    <w:p>
+      <w:pPr>
+        <w:ind w:left="1440"/>
+      </w:pPr>
+      <w:r>
+        <w:t>E – I’ll make sure to beat a few lessons into ya first brat</w:t>
       </w:r>
       <w:r>
         <w:t>,</w:t>
       </w:r>
       <w:r>
         <w:t xml:space="preserve"> now scram.</w:t>
+      </w:r>
+      <w:r>
+        <w:t xml:space="preserve"> 11003</w:t>
       </w:r>
     </w:p>
     <w:p>
@@ -527,6 +628,7 @@
     </w:p>
     <w:p>
       <w:r>
+        <w:lastRenderedPageBreak/>
         <w:tab/>
       </w:r>
       <w:r>
@@ -536,6 +638,337 @@
     </w:p>
     <w:p>
       <w:r>
+        <w:tab/>
+      </w:r>
+      <w:r>
+        <w:tab/>
+      </w:r>
+      <w:r>
+        <w:tab/>
+        <w:t>P – How does everyone know I’m not from around here.</w:t>
+      </w:r>
+    </w:p>
+    <w:p>
+      <w:r>
+        <w:tab/>
+      </w:r>
+      <w:r>
+        <w:tab/>
+      </w:r>
+      <w:r>
+        <w:tab/>
+      </w:r>
+      <w:r>
+        <w:tab/>
+        <w:t>K – Theres only older people left in this village.</w:t>
+      </w:r>
+    </w:p>
+    <w:p>
+      <w:r>
+        <w:tab/>
+      </w:r>
+      <w:r>
+        <w:tab/>
+      </w:r>
+      <w:r>
+        <w:tab/>
+      </w:r>
+      <w:r>
+        <w:tab/>
+      </w:r>
+      <w:r>
+        <w:tab/>
+        <w:t>P – Why is that.</w:t>
+      </w:r>
+    </w:p>
+    <w:p>
+      <w:pPr>
+        <w:ind w:left="2880"/>
+      </w:pPr>
+      <w:r>
+        <w:t>K – If you want more information go talk to The Elder, he will be more willing to accommodate you.</w:t>
+      </w:r>
+    </w:p>
+    <w:p>
+      <w:pPr>
+        <w:ind w:left="2880"/>
+      </w:pPr>
+      <w:r>
+        <w:tab/>
+        <w:t>P – That old man is the one that sent me here.</w:t>
+      </w:r>
+    </w:p>
+    <w:p>
+      <w:pPr>
+        <w:ind w:left="2880"/>
+      </w:pPr>
+      <w:r>
+        <w:tab/>
+      </w:r>
+      <w:r>
+        <w:tab/>
+        <w:t>K – K</w:t>
+      </w:r>
+      <w:r>
+        <w:t>2</w:t>
+      </w:r>
+    </w:p>
+    <w:p>
+      <w:pPr>
+        <w:ind w:left="2880"/>
+      </w:pPr>
+      <w:r>
+        <w:tab/>
+        <w:t>P – He didn’t seem very friendly before.</w:t>
+      </w:r>
+    </w:p>
+    <w:p>
+      <w:pPr>
+        <w:ind w:left="2880"/>
+      </w:pPr>
+      <w:r>
+        <w:tab/>
+      </w:r>
+      <w:r>
+        <w:tab/>
+        <w:t>K – K</w:t>
+      </w:r>
+      <w:r>
+        <w:t>2</w:t>
+      </w:r>
+    </w:p>
+    <w:p>
+      <w:pPr>
+        <w:ind w:left="2880"/>
+      </w:pPr>
+      <w:r>
+        <w:t>K</w:t>
+      </w:r>
+      <w:r>
+        <w:t>2</w:t>
+      </w:r>
+      <w:r>
+        <w:t xml:space="preserve"> – If he sent you here then I guess he’s playing his old tricks again.</w:t>
+      </w:r>
+    </w:p>
+    <w:p>
+      <w:pPr>
+        <w:ind w:left="2880" w:firstLine="720"/>
+      </w:pPr>
+      <w:r>
+        <w:t>P – So he does this to everyone.</w:t>
+      </w:r>
+    </w:p>
+    <w:p>
+      <w:pPr>
+        <w:ind w:left="2880"/>
+      </w:pPr>
+      <w:r>
+        <w:t>K – You certainly aren’t the first, but at this rate you may very well be the last.</w:t>
+      </w:r>
+    </w:p>
+    <w:p>
+      <w:pPr>
+        <w:ind w:left="3600"/>
+      </w:pPr>
+      <w:r>
+        <w:t>P – If you aren’t going to tell me anything can I go see the old lady.</w:t>
+      </w:r>
+    </w:p>
+    <w:p>
+      <w:r>
+        <w:tab/>
+      </w:r>
+      <w:r>
+        <w:tab/>
+      </w:r>
+      <w:r>
+        <w:tab/>
+      </w:r>
+      <w:r>
+        <w:tab/>
+        <w:t>K – Afraid you’re not in luck, she’s already “crossed the river”.</w:t>
+      </w:r>
+    </w:p>
+    <w:p>
+      <w:r>
+        <w:tab/>
+      </w:r>
+      <w:r>
+        <w:tab/>
+      </w:r>
+      <w:r>
+        <w:tab/>
+      </w:r>
+      <w:r>
+        <w:tab/>
+      </w:r>
+      <w:r>
+        <w:tab/>
+        <w:t>P – Is there at least a stopwatch in there.</w:t>
+      </w:r>
+    </w:p>
+    <w:p>
+      <w:r>
+        <w:tab/>
+      </w:r>
+      <w:r>
+        <w:tab/>
+      </w:r>
+      <w:r>
+        <w:tab/>
+      </w:r>
+      <w:r>
+        <w:tab/>
+        <w:t>K – You can have it if you want.</w:t>
+      </w:r>
+    </w:p>
+    <w:p>
+      <w:r>
+        <w:tab/>
+      </w:r>
+      <w:r>
+        <w:tab/>
+      </w:r>
+      <w:r>
+        <w:tab/>
+      </w:r>
+      <w:r>
+        <w:tab/>
+      </w:r>
+      <w:r>
+        <w:tab/>
+        <w:t xml:space="preserve">P – </w:t>
+      </w:r>
+      <w:r>
+        <w:t>You’re</w:t>
+      </w:r>
+      <w:r>
+        <w:t xml:space="preserve"> just giving it to me?</w:t>
+      </w:r>
+    </w:p>
+    <w:p>
+      <w:pPr>
+        <w:ind w:left="4320"/>
+      </w:pPr>
+      <w:r>
+        <w:t>K – Its not worth much to anyone except for The Elder anyway.</w:t>
+      </w:r>
+    </w:p>
+    <w:p>
+      <w:pPr>
+        <w:ind w:left="4320"/>
+      </w:pPr>
+      <w:r>
+        <w:tab/>
+        <w:t>END</w:t>
+      </w:r>
+    </w:p>
+    <w:p>
+      <w:r>
+        <w:tab/>
+      </w:r>
+      <w:r>
+        <w:tab/>
+      </w:r>
+      <w:r>
+        <w:tab/>
+      </w:r>
+      <w:r>
+        <w:tab/>
+      </w:r>
+      <w:r>
+        <w:tab/>
+        <w:t xml:space="preserve">P </w:t>
+      </w:r>
+      <w:r>
+        <w:t>–</w:t>
+      </w:r>
+      <w:r>
+        <w:t xml:space="preserve"> </w:t>
+      </w:r>
+      <w:r>
+        <w:t>Guess I’ll give this to the old man then.</w:t>
+      </w:r>
+    </w:p>
+    <w:p>
+      <w:r>
+        <w:tab/>
+      </w:r>
+      <w:r>
+        <w:tab/>
+      </w:r>
+      <w:r>
+        <w:tab/>
+      </w:r>
+      <w:r>
+        <w:tab/>
+      </w:r>
+      <w:r>
+        <w:tab/>
+      </w:r>
+      <w:r>
+        <w:tab/>
+        <w:t>END</w:t>
+      </w:r>
+    </w:p>
+    <w:p>
+      <w:r>
+        <w:tab/>
+      </w:r>
+      <w:r>
+        <w:tab/>
+      </w:r>
+      <w:r>
+        <w:tab/>
+        <w:t xml:space="preserve">P </w:t>
+      </w:r>
+      <w:r>
+        <w:t>–</w:t>
+      </w:r>
+      <w:r>
+        <w:t xml:space="preserve"> </w:t>
+      </w:r>
+      <w:r>
+        <w:t>I could say the same about you.</w:t>
+      </w:r>
+    </w:p>
+    <w:p>
+      <w:pPr>
+        <w:ind w:left="2880"/>
+      </w:pPr>
+      <w:r>
+        <w:t>K – I came from this village so I’m just a man coming to see his home one last time.</w:t>
+      </w:r>
+    </w:p>
+    <w:p>
+      <w:pPr>
+        <w:ind w:left="2880"/>
+      </w:pPr>
+      <w:r>
+        <w:tab/>
+        <w:t>P – Why is this the last time?</w:t>
+      </w:r>
+    </w:p>
+    <w:p>
+      <w:pPr>
+        <w:ind w:left="4320"/>
+      </w:pPr>
+      <w:r>
+        <w:t>K – If The Elder sent you then take this stopwatch and be gone, I’m in no mood to talk to stranger.</w:t>
+      </w:r>
+    </w:p>
+    <w:p>
+      <w:pPr>
+        <w:ind w:left="4320"/>
+      </w:pPr>
+      <w:r>
+        <w:tab/>
+        <w:t>END</w:t>
+      </w:r>
+    </w:p>
+    <w:p>
+      <w:r>
         <w:lastRenderedPageBreak/>
         <w:tab/>
       </w:r>
@@ -544,206 +977,13 @@
       </w:r>
       <w:r>
         <w:tab/>
-        <w:t>P – How does everyone know I’m not from around here.</w:t>
-      </w:r>
-    </w:p>
-    <w:p>
-      <w:r>
-        <w:tab/>
-      </w:r>
-      <w:r>
-        <w:tab/>
-      </w:r>
-      <w:r>
-        <w:tab/>
-      </w:r>
-      <w:r>
-        <w:tab/>
-        <w:t>K – Theres only older people left in this village.</w:t>
-      </w:r>
-    </w:p>
-    <w:p>
-      <w:r>
-        <w:tab/>
-      </w:r>
-      <w:r>
-        <w:tab/>
-      </w:r>
-      <w:r>
-        <w:tab/>
-      </w:r>
-      <w:r>
-        <w:tab/>
-      </w:r>
-      <w:r>
-        <w:tab/>
-        <w:t>P – Why is that.</w:t>
-      </w:r>
-    </w:p>
-    <w:p>
-      <w:pPr>
-        <w:ind w:left="2880"/>
-      </w:pPr>
-      <w:r>
-        <w:t>K – If you want more information go talk to The Elder, he will be more willing to accommodate you.</w:t>
-      </w:r>
-    </w:p>
-    <w:p>
-      <w:pPr>
-        <w:ind w:left="2880"/>
-      </w:pPr>
-      <w:r>
-        <w:tab/>
-        <w:t>P – That old man is the one that sent me here.</w:t>
-      </w:r>
-    </w:p>
-    <w:p>
-      <w:pPr>
-        <w:ind w:left="2880"/>
-      </w:pPr>
-      <w:r>
-        <w:tab/>
-      </w:r>
-      <w:r>
-        <w:tab/>
-        <w:t>K – K</w:t>
-      </w:r>
-      <w:r>
-        <w:t>2</w:t>
-      </w:r>
-    </w:p>
-    <w:p>
-      <w:pPr>
-        <w:ind w:left="2880"/>
-      </w:pPr>
-      <w:r>
-        <w:tab/>
-        <w:t>P – He didn’t seem very friendly before.</w:t>
-      </w:r>
-    </w:p>
-    <w:p>
-      <w:pPr>
-        <w:ind w:left="2880"/>
-      </w:pPr>
-      <w:r>
-        <w:tab/>
-      </w:r>
-      <w:r>
-        <w:tab/>
-        <w:t>K – K</w:t>
-      </w:r>
-      <w:r>
-        <w:t>2</w:t>
-      </w:r>
-    </w:p>
-    <w:p>
-      <w:pPr>
-        <w:ind w:left="2880"/>
-      </w:pPr>
-      <w:r>
-        <w:t>K</w:t>
-      </w:r>
-      <w:r>
-        <w:t>2</w:t>
-      </w:r>
-      <w:r>
-        <w:t xml:space="preserve"> – If he sent you here then I guess he’s playing his old tricks again.</w:t>
-      </w:r>
-    </w:p>
-    <w:p>
-      <w:pPr>
-        <w:ind w:left="2880" w:firstLine="720"/>
-      </w:pPr>
-      <w:r>
-        <w:t>P – So he does this to everyone.</w:t>
-      </w:r>
-    </w:p>
-    <w:p>
-      <w:pPr>
-        <w:ind w:left="2880"/>
-      </w:pPr>
-      <w:r>
-        <w:t>K – You certainly aren’t the first, but at this rate you may very well be the last.</w:t>
-      </w:r>
-    </w:p>
-    <w:p>
-      <w:pPr>
-        <w:ind w:left="3600"/>
-      </w:pPr>
-      <w:r>
-        <w:t>P – If you aren’t going to tell me anything can I go see the old lady.</w:t>
-      </w:r>
-    </w:p>
-    <w:p>
-      <w:r>
-        <w:tab/>
-      </w:r>
-      <w:r>
-        <w:tab/>
-      </w:r>
-      <w:r>
-        <w:tab/>
-      </w:r>
-      <w:r>
-        <w:tab/>
-        <w:t>K – Afraid you’re not in luck, she’s already “crossed the river”.</w:t>
-      </w:r>
-    </w:p>
-    <w:p>
-      <w:r>
-        <w:tab/>
-      </w:r>
-      <w:r>
-        <w:tab/>
-      </w:r>
-      <w:r>
-        <w:tab/>
-      </w:r>
-      <w:r>
-        <w:tab/>
-      </w:r>
-      <w:r>
-        <w:tab/>
-        <w:t>P – Is there at least a stopwatch in there.</w:t>
-      </w:r>
-    </w:p>
-    <w:p>
-      <w:r>
-        <w:tab/>
-      </w:r>
-      <w:r>
-        <w:tab/>
-      </w:r>
-      <w:r>
-        <w:tab/>
-      </w:r>
-      <w:r>
-        <w:tab/>
-        <w:t>K – You can have it if you want.</w:t>
-      </w:r>
-    </w:p>
-    <w:p>
-      <w:r>
-        <w:tab/>
-      </w:r>
-      <w:r>
-        <w:tab/>
-      </w:r>
-      <w:r>
-        <w:tab/>
-      </w:r>
-      <w:r>
-        <w:tab/>
-      </w:r>
-      <w:r>
-        <w:tab/>
-        <w:t xml:space="preserve">P – </w:t>
-      </w:r>
-      <w:r>
-        <w:t>You’re</w:t>
-      </w:r>
-      <w:r>
-        <w:t xml:space="preserve"> just giving it to me?</w:t>
+      </w:r>
+      <w:r>
+        <w:tab/>
+      </w:r>
+      <w:r>
+        <w:tab/>
+        <w:t>P – You being sent to the gallows or something?</w:t>
       </w:r>
     </w:p>
     <w:p>
@@ -751,178 +991,7 @@
         <w:ind w:left="4320"/>
       </w:pPr>
       <w:r>
-        <w:t xml:space="preserve">K – </w:t>
-      </w:r>
-      <w:proofErr w:type="spellStart"/>
-      <w:r>
-        <w:t>Its</w:t>
-      </w:r>
-      <w:proofErr w:type="spellEnd"/>
-      <w:r>
-        <w:t xml:space="preserve"> not worth much to anyone except for The Elder anyway.</w:t>
-      </w:r>
-    </w:p>
-    <w:p>
-      <w:pPr>
-        <w:ind w:left="4320"/>
-      </w:pPr>
-      <w:r>
-        <w:tab/>
-        <w:t>END</w:t>
-      </w:r>
-    </w:p>
-    <w:p>
-      <w:r>
-        <w:tab/>
-      </w:r>
-      <w:r>
-        <w:tab/>
-      </w:r>
-      <w:r>
-        <w:tab/>
-      </w:r>
-      <w:r>
-        <w:tab/>
-      </w:r>
-      <w:r>
-        <w:tab/>
-        <w:t xml:space="preserve">P </w:t>
-      </w:r>
-      <w:r>
-        <w:t>–</w:t>
-      </w:r>
-      <w:r>
-        <w:t xml:space="preserve"> </w:t>
-      </w:r>
-      <w:r>
-        <w:t>Guess I’ll give this to the old man then.</w:t>
-      </w:r>
-    </w:p>
-    <w:p>
-      <w:r>
-        <w:tab/>
-      </w:r>
-      <w:r>
-        <w:tab/>
-      </w:r>
-      <w:r>
-        <w:tab/>
-      </w:r>
-      <w:r>
-        <w:tab/>
-      </w:r>
-      <w:r>
-        <w:tab/>
-      </w:r>
-      <w:r>
-        <w:tab/>
-        <w:t>END</w:t>
-      </w:r>
-    </w:p>
-    <w:p>
-      <w:r>
-        <w:tab/>
-      </w:r>
-      <w:r>
-        <w:tab/>
-      </w:r>
-      <w:r>
-        <w:tab/>
-        <w:t xml:space="preserve">P </w:t>
-      </w:r>
-      <w:r>
-        <w:t>–</w:t>
-      </w:r>
-      <w:r>
-        <w:t xml:space="preserve"> </w:t>
-      </w:r>
-      <w:r>
-        <w:t>I could say the same about you.</w:t>
-      </w:r>
-    </w:p>
-    <w:p>
-      <w:pPr>
-        <w:ind w:left="2880"/>
-      </w:pPr>
-      <w:r>
-        <w:t>K – I came from this village so I’m just a man coming to see his home one last time.</w:t>
-      </w:r>
-    </w:p>
-    <w:p>
-      <w:pPr>
-        <w:ind w:left="2880"/>
-      </w:pPr>
-      <w:r>
-        <w:tab/>
-        <w:t>P – Why is this the last time?</w:t>
-      </w:r>
-    </w:p>
-    <w:p>
-      <w:pPr>
-        <w:ind w:left="4320"/>
-      </w:pPr>
-      <w:r>
-        <w:t xml:space="preserve">K – If </w:t>
-      </w:r>
-      <w:proofErr w:type="gramStart"/>
-      <w:r>
-        <w:t>The</w:t>
-      </w:r>
-      <w:proofErr w:type="gramEnd"/>
-      <w:r>
-        <w:t xml:space="preserve"> Elder sent you then take this stopwatch and be </w:t>
-      </w:r>
-      <w:proofErr w:type="gramStart"/>
-      <w:r>
-        <w:t>gone,</w:t>
-      </w:r>
-      <w:proofErr w:type="gramEnd"/>
-      <w:r>
-        <w:t xml:space="preserve"> I’m in no mood to talk to stranger.</w:t>
-      </w:r>
-    </w:p>
-    <w:p>
-      <w:pPr>
-        <w:ind w:left="4320"/>
-      </w:pPr>
-      <w:r>
-        <w:tab/>
-        <w:t>END</w:t>
-      </w:r>
-    </w:p>
-    <w:p>
-      <w:r>
-        <w:tab/>
-      </w:r>
-      <w:r>
-        <w:tab/>
-      </w:r>
-      <w:r>
-        <w:tab/>
-      </w:r>
-      <w:r>
-        <w:tab/>
-      </w:r>
-      <w:r>
-        <w:tab/>
-        <w:t>P – You being sent to the gallows or something?</w:t>
-      </w:r>
-    </w:p>
-    <w:p>
-      <w:pPr>
-        <w:ind w:left="4320"/>
-      </w:pPr>
-      <w:r>
-        <w:lastRenderedPageBreak/>
-        <w:t xml:space="preserve">K – It’s not me that’s about to pass on, so if I was </w:t>
-      </w:r>
-      <w:proofErr w:type="gramStart"/>
-      <w:r>
-        <w:t>you</w:t>
-      </w:r>
-      <w:proofErr w:type="gramEnd"/>
-      <w:r>
-        <w:t xml:space="preserve"> I would leave this village soon.</w:t>
+        <w:t>K – It’s not me that’s about to pass on, so if I was you I would leave this village soon.</w:t>
       </w:r>
     </w:p>
     <w:p>
@@ -1104,15 +1173,7 @@
       </w:pPr>
       <w:r>
         <w:tab/>
-        <w:t xml:space="preserve">P – I have no idea what </w:t>
-      </w:r>
-      <w:proofErr w:type="gramStart"/>
-      <w:r>
-        <w:t>your</w:t>
-      </w:r>
-      <w:proofErr w:type="gramEnd"/>
-      <w:r>
-        <w:t xml:space="preserve"> prattling on about.</w:t>
+        <w:t>P – I have no idea what your prattling on about.</w:t>
       </w:r>
     </w:p>
     <w:p>
@@ -1164,15 +1225,7 @@
         <w:ind w:left="1440"/>
       </w:pPr>
       <w:r>
-        <w:t xml:space="preserve">E – Our </w:t>
-      </w:r>
-      <w:proofErr w:type="spellStart"/>
-      <w:r>
-        <w:t>o’so</w:t>
-      </w:r>
-      <w:proofErr w:type="spellEnd"/>
-      <w:r>
-        <w:t xml:space="preserve"> benevolent lord gave us the option of reinforcing his cannon fodder division.</w:t>
+        <w:t>E – Our o’so benevolent lord gave us the option of reinforcing his cannon fodder division.</w:t>
       </w:r>
     </w:p>
     <w:p>
@@ -1347,23 +1400,7 @@
     </w:p>
     <w:p>
       <w:r>
-        <w:t xml:space="preserve">W – Where am I </w:t>
-      </w:r>
-      <w:proofErr w:type="spellStart"/>
-      <w:r>
-        <w:t>gonna</w:t>
-      </w:r>
-      <w:proofErr w:type="spellEnd"/>
-      <w:r>
-        <w:t xml:space="preserve"> stay, where can I stay, my cousin they </w:t>
-      </w:r>
-      <w:proofErr w:type="gramStart"/>
-      <w:r>
-        <w:t>have to</w:t>
-      </w:r>
-      <w:proofErr w:type="gramEnd"/>
-      <w:r>
-        <w:t xml:space="preserve"> let me stay with them.</w:t>
+        <w:t>W – Where am I gonna stay, where can I stay, my cousin they have to let me stay with them.</w:t>
       </w:r>
     </w:p>
     <w:p>
@@ -1445,15 +1482,7 @@
         </w:pBdr>
       </w:pPr>
       <w:r>
-        <w:t xml:space="preserve">B – He should have given us money or make </w:t>
-      </w:r>
-      <w:proofErr w:type="gramStart"/>
-      <w:r>
-        <w:t>it</w:t>
-      </w:r>
-      <w:proofErr w:type="gramEnd"/>
-      <w:r>
-        <w:t xml:space="preserve"> so we pay less taxes or something.</w:t>
+        <w:t>B – He should have given us money or make it so we pay less taxes or something.</w:t>
       </w:r>
     </w:p>
     <w:p>

</xml_diff>